<commit_message>
AI cert: opt-in per form + add Miami-Dade AO 26-04
- New `used_ai` checkbox in a "Generative AI Disclosure" section at the
  bottom of every form that can carry a cert (default OFF). 19 forms.
- Cert wraps in `{#used_ai}{#county_is_*}...{/}{/}` — both flags must be
  true to render.
- Miami-Dade AO 26-04 cert added with verbatim AO text (fixes BUG-3 from
  2026-04-29 live test).
- Hard rule preserved: no AI cert on any judge-signed Order or Letters
  template (P3-ORDER, P3-LETTERS, P2-ORDER, P3-CURATOR-ORDER,
  P3-CURATOR-LETTERS).

Reason: court-published merge-template forms with deterministic field
substitution don't constitute generative-AI use within the meaning of
the AOs. The opt-in checkbox lets the user affirmatively flip it on the
rare form where they actually drafted prose with AI.

Tag audit: PASS.
</commit_message>
<xml_diff>
--- a/templates/G2-010.docx
+++ b/templates/G2-010.docx
@@ -1216,7 +1216,23 @@
           <w:i w:val="0"/>
           <w:sz w:val="24"/>
         </w:rPr>
-        <w:t>{#county_is_broward}The undersigned hereby certifies that generative artificial intelligence was used to prepare this Petition to Determine Incapacity. The undersigned has independently verified the accuracy of every citation to the law and/or the record, and the accuracy of any language drafted by generative artificial intelligence, including quotations, citations, paraphrased assertions, facts, and legal analysis.{/county_is_broward}</w:t>
+        <w:t>{#used_ai}{#county_is_broward}The undersigned hereby certifies that generative artificial intelligence was used to prepare this Petition to Determine Incapacity. The undersigned has independently verified the accuracy of every citation to the law and/or the record, and the accuracy of any language drafted by generative artificial intelligence, including quotations, citations, paraphrased assertions, facts, and legal analysis.{/county_is_broward}{/used_ai}</w:t>
+      </w:r>
+    </w:p>
+    <w:p>
+      <w:pPr>
+        <w:spacing w:before="120" w:after="360"/>
+        <w:ind w:firstLine="720"/>
+        <w:jc w:val="left"/>
+      </w:pPr>
+      <w:r>
+        <w:rPr>
+          <w:rFonts w:ascii="Times New Roman" w:hAnsi="Times New Roman" w:cs="Times New Roman"/>
+          <w:b w:val="0"/>
+          <w:i w:val="0"/>
+          <w:sz w:val="24"/>
+        </w:rPr>
+        <w:t>{#used_ai}{#county_is_miami_dade}Generative artificial intelligence was used in the preparation of this filing. The undersigned certifies that all factual assertions, legal authority, and citations have been independently reviewed and verified for accuracy and accepts full responsibility for the contents of this filing.{/county_is_miami_dade}{/used_ai}</w:t>
       </w:r>
     </w:p>
     <w:p>

</xml_diff>